<commit_message>
Tidy quotes and details; take down two pieces; fix Ian Hamilton cover
Indent quoted verse and extracts in 19 pieces (outer quotation marks
removed), trim book details to titles, authors, publishers, pages and
prices, mark Khalvati and Wilkinson as drafts, and use the Against
Oblivion jacket for the Ian Hamilton review.

Co-Authored-By: Claude Sonnet 5.5 <noreply@anthropic.com>
</commit_message>
<xml_diff>
--- a/content-src/docx/A G 2004 04 10 Prynne.docx
+++ b/content-src/docx/A G 2004 04 10 Prynne.docx
@@ -253,31 +253,37 @@
         <w:t>But when, next year, a revised and expanded Poems is published, those who feel the later work has become so shockingly unconventional, looking at first glance like a Dadaist barrage of unconnected words, will have to reckon with the anomalous "Pearls That Were", from 1999, predominantly using highly familiar patterns of cadence and rhyme:</w:t>
       </w:r>
     </w:p>
-    <w:p/>
-    <w:p>
-      <w:r>
-        <w:t>So Orpheus tamed the wild beasts</w:t>
-      </w:r>
-    </w:p>
-    <w:p>
-      <w:r>
-        <w:t>for long night comes down</w:t>
-      </w:r>
-    </w:p>
-    <w:p>
-      <w:r>
-        <w:t>moving naked, over the wound,</w:t>
-      </w:r>
-    </w:p>
-    <w:p>
-      <w:r>
-        <w:t>the gem from the crown.</w:t>
-      </w:r>
-    </w:p>
-    <w:p/>
-    <w:p>
-      <w:r>
-        <w:lastRenderedPageBreak/>
+    <w:p>
+      <w:r>
+        <w:t xml:space="preserve">&lt;quote&gt;</w:t>
+      </w:r>
+      <w:r>
+        <w:t xml:space="preserve">So Orpheus tamed the wild beasts</w:t>
+      </w:r>
+      <w:r>
+        <w:br/>
+      </w:r>
+      <w:r>
+        <w:t xml:space="preserve">for long night comes down</w:t>
+      </w:r>
+      <w:r>
+        <w:br/>
+      </w:r>
+      <w:r>
+        <w:t xml:space="preserve">moving naked, over the wound,</w:t>
+      </w:r>
+      <w:r>
+        <w:br/>
+      </w:r>
+      <w:r>
+        <w:t xml:space="preserve">the gem from the crown.</w:t>
+      </w:r>
+      <w:r>
+        <w:t xml:space="preserve">&lt;/quote&gt;</w:t>
+      </w:r>
+    </w:p>
+    <w:p>
+      <w:r>
         <w:t xml:space="preserve">For years, I found Prynne's poetry repellent, until the work itself changed my mind. (The epigraph to the 1979 poem "Down Where Changed" is ostensibly taken from </w:t>
       </w:r>
       <w:r>
@@ -285,24 +291,42 @@
           <w:i/>
           <w:iCs/>
         </w:rPr>
-        <w:t>Practical Crystal Gazing</w:t>
-      </w:r>
-      <w:r>
-        <w:t xml:space="preserve"> by C Thorpe, and teasingly reads: "Anyone who takes up this book will, we expect, have done so because at the back of his mind he has a half-formed belief that there is something in it." I have always taken this as a disconcerting joke.)</w:t>
-      </w:r>
-    </w:p>
-    <w:p/>
-    <w:p>
-      <w:r>
-        <w:t xml:space="preserve">The obstacles to understanding are not simply the disruption of linear order and conventional syntax. After all, these approaches are decades-old, traditionally modernist, and should not alarm readers in a world of cinematic jump-cuts, internet hyperlinks, and quantum physics. More than 90 years ago, Ezra Pound noted: "We no longer think or need to think in terms of </w:t>
-      </w:r>
-      <w:proofErr w:type="spellStart"/>
-      <w:r>
-        <w:t>monolinear</w:t>
-      </w:r>
-      <w:proofErr w:type="spellEnd"/>
-      <w:r>
-        <w:t xml:space="preserve"> logic, the sentence structure, subject, predicate, object etc. We are as capable or almost as capable as the biologist of thinking thoughts that join like spokes in a wheel-hub and that fuse in hyper-geometric amalgams."</w:t>
+        <w:t xml:space="preserve">Practical Crystal Gazing</w:t>
+      </w:r>
+      <w:r>
+        <w:t xml:space="preserve"> by C Thorpe, and teasingly reads: </w:t>
+      </w:r>
+      <w:r>
+        <w:t xml:space="preserve">&lt;quote&gt;</w:t>
+      </w:r>
+      <w:r>
+        <w:t xml:space="preserve">Anyone who takes up this book will, we expect, have done so because at the back of his mind he has a half-formed belief that there is something in it.</w:t>
+      </w:r>
+      <w:r>
+        <w:t xml:space="preserve">&lt;/quote&gt;</w:t>
+      </w:r>
+      <w:r>
+        <w:t xml:space="preserve"> I have always taken this as a disconcerting joke.)</w:t>
+      </w:r>
+    </w:p>
+    <w:p>
+      <w:r>
+        <w:t xml:space="preserve">The obstacles to understanding are not simply the disruption of linear order and conventional syntax. After all, these approaches are decades-old, traditionally modernist, and should not alarm readers in a world of cinematic jump-cuts, internet hyperlinks, and quantum physics. More than 90 years ago, Ezra Pound noted: </w:t>
+      </w:r>
+      <w:r>
+        <w:t xml:space="preserve">&lt;quote&gt;</w:t>
+      </w:r>
+      <w:r>
+        <w:t xml:space="preserve">We no longer think or need to think in terms of </w:t>
+      </w:r>
+      <w:r>
+        <w:t xml:space="preserve">monolinear</w:t>
+      </w:r>
+      <w:r>
+        <w:t xml:space="preserve"> logic, the sentence structure, subject, predicate, object etc. We are as capable or almost as capable as the biologist of thinking thoughts that join like spokes in a wheel-hub and that fuse in hyper-geometric amalgams.</w:t>
+      </w:r>
+      <w:r>
+        <w:t xml:space="preserve">&lt;/quote&gt;</w:t>
       </w:r>
     </w:p>
     <w:p/>
@@ -478,21 +502,27 @@
         <w:t>lines of political and personal interpretation.</w:t>
       </w:r>
     </w:p>
-    <w:p/>
-    <w:p>
-      <w:r>
-        <w:t>Context is everything. Language itself (as Prynne's etymological and philological forays suggest) carries residual traces of its historical and literary uses and contexts; it is neither pure nor innocent, and</w:t>
-      </w:r>
-      <w:r>
-        <w:t xml:space="preserve"> is not simply a coin that can be uncomplicatedly traded for a single meaning. What Prynne's work presents us with is not his opinions, scrambled and awaiting our delighted decryption, but the simultaneous processes and viewpoints of the worlds created in language. As he once wrote, in the closest he has come to a personal statement on his method: "It has mostly been my own aspiration, for example, to establish relations not personally with the reader, but with the world and its layers of shifted but </w:t>
-      </w:r>
-      <w:proofErr w:type="spellStart"/>
-      <w:r>
-        <w:t>recognisable</w:t>
-      </w:r>
-      <w:proofErr w:type="spellEnd"/>
-      <w:r>
-        <w:t xml:space="preserve"> usage; and thereby with the reader's own position within this world."</w:t>
+    <w:p>
+      <w:r>
+        <w:t xml:space="preserve">Context is everything. Language itself (as Prynne's etymological and philological forays suggest) carries residual traces of its historical and literary uses and contexts; it is neither pure nor innocent, and</w:t>
+      </w:r>
+      <w:r>
+        <w:t xml:space="preserve"> is not simply a coin that can be uncomplicatedly traded for a single meaning. What Prynne's work presents us with is not his opinions, scrambled and awaiting our delighted decryption, but the simultaneous processes and viewpoints of the worlds created in language. As he once wrote, in the closest he has come to a personal statement on his method: </w:t>
+      </w:r>
+      <w:r>
+        <w:t xml:space="preserve">&lt;quote&gt;</w:t>
+      </w:r>
+      <w:r>
+        <w:t xml:space="preserve">It has mostly been my own aspiration, for example, to establish relations not personally with the reader, but with the world and its layers of shifted but </w:t>
+      </w:r>
+      <w:r>
+        <w:t xml:space="preserve">recognisable</w:t>
+      </w:r>
+      <w:r>
+        <w:t xml:space="preserve"> usage; and thereby with the reader's own position within this world.</w:t>
+      </w:r>
+      <w:r>
+        <w:t xml:space="preserve">&lt;/quote&gt;</w:t>
       </w:r>
     </w:p>
     <w:p/>

</xml_diff>

<commit_message>
Oval Window: keep only the poem indented; restore the in-paragraph quotations
Co-Authored-By: Claude Sonnet 5.5 <noreply@anthropic.com>
</commit_message>
<xml_diff>
--- a/content-src/docx/A G 2004 04 10 Prynne.docx
+++ b/content-src/docx/A G 2004 04 10 Prynne.docx
@@ -297,13 +297,13 @@
         <w:t xml:space="preserve"> by C Thorpe, and teasingly reads: </w:t>
       </w:r>
       <w:r>
-        <w:t xml:space="preserve">&lt;quote&gt;</w:t>
+        <w:t xml:space="preserve">"</w:t>
       </w:r>
       <w:r>
         <w:t xml:space="preserve">Anyone who takes up this book will, we expect, have done so because at the back of his mind he has a half-formed belief that there is something in it.</w:t>
       </w:r>
       <w:r>
-        <w:t xml:space="preserve">&lt;/quote&gt;</w:t>
+        <w:t xml:space="preserve">"</w:t>
       </w:r>
       <w:r>
         <w:t xml:space="preserve"> I have always taken this as a disconcerting joke.)</w:t>
@@ -314,7 +314,7 @@
         <w:t xml:space="preserve">The obstacles to understanding are not simply the disruption of linear order and conventional syntax. After all, these approaches are decades-old, traditionally modernist, and should not alarm readers in a world of cinematic jump-cuts, internet hyperlinks, and quantum physics. More than 90 years ago, Ezra Pound noted: </w:t>
       </w:r>
       <w:r>
-        <w:t xml:space="preserve">&lt;quote&gt;</w:t>
+        <w:t xml:space="preserve">"</w:t>
       </w:r>
       <w:r>
         <w:t xml:space="preserve">We no longer think or need to think in terms of </w:t>
@@ -326,7 +326,7 @@
         <w:t xml:space="preserve"> logic, the sentence structure, subject, predicate, object etc. We are as capable or almost as capable as the biologist of thinking thoughts that join like spokes in a wheel-hub and that fuse in hyper-geometric amalgams.</w:t>
       </w:r>
       <w:r>
-        <w:t xml:space="preserve">&lt;/quote&gt;</w:t>
+        <w:t xml:space="preserve">"</w:t>
       </w:r>
     </w:p>
     <w:p/>
@@ -510,7 +510,7 @@
         <w:t xml:space="preserve"> is not simply a coin that can be uncomplicatedly traded for a single meaning. What Prynne's work presents us with is not his opinions, scrambled and awaiting our delighted decryption, but the simultaneous processes and viewpoints of the worlds created in language. As he once wrote, in the closest he has come to a personal statement on his method: </w:t>
       </w:r>
       <w:r>
-        <w:t xml:space="preserve">&lt;quote&gt;</w:t>
+        <w:t xml:space="preserve">"</w:t>
       </w:r>
       <w:r>
         <w:t xml:space="preserve">It has mostly been my own aspiration, for example, to establish relations not personally with the reader, but with the world and its layers of shifted but </w:t>
@@ -522,7 +522,7 @@
         <w:t xml:space="preserve"> usage; and thereby with the reader's own position within this world.</w:t>
       </w:r>
       <w:r>
-        <w:t xml:space="preserve">&lt;/quote&gt;</w:t>
+        <w:t xml:space="preserve">"</w:t>
       </w:r>
     </w:p>
     <w:p/>

</xml_diff>

<commit_message>
Replace spaced and three-dot ellipses with … across the archive (source .docx and generated pages)
Co-Authored-By: Claude Sonnet 5.5 <noreply@anthropic.com>
</commit_message>
<xml_diff>
--- a/content-src/docx/A G 2004 04 10 Prynne.docx
+++ b/content-src/docx/A G 2004 04 10 Prynne.docx
@@ -97,7 +97,7 @@
         <w:t xml:space="preserve"> in 1999, and more recently he said he would never read in England. Asked why he was reading on this occasion, he replied: "That's another question"; but in his introduction he did seem to draw a distinction b</w:t>
       </w:r>
       <w:r>
-        <w:t>etween "the voice of the poem" and "the voice of the poet" ("an accident of biography... which does not interest me").</w:t>
+        <w:t>etween "the voice of the poem" and "the voice of the poet" ("an accident of biography… which does not interest me").</w:t>
       </w:r>
     </w:p>
     <w:p/>
@@ -231,7 +231,7 @@
       </w:r>
       <w:proofErr w:type="spellEnd"/>
       <w:r>
-        <w:t>, John Sutherland suggested that "only four people... can understand him". He is regarded as having no readership.</w:t>
+        <w:t>, John Sutherland suggested that "only four people… can understand him". He is regarded as having no readership.</w:t>
       </w:r>
     </w:p>
     <w:p/>
@@ -246,10 +246,10 @@
     <w:p/>
     <w:p>
       <w:r>
-        <w:t>The poems are not immediately inviting: there is no ingratiation and glad hand, no drum roll or enticing McGuffin, no attention-grabbing dramatics. "Profuse reclaim from a scrape or belt, funnel do / axial parenthood block the mustard dots briefly / act forward..."; "Assuming banishment for lost time back across nullity..."; "Pacify rag hands attachment in for muted / counter-march</w:t>
-      </w:r>
-      <w:r>
-        <w:t xml:space="preserve"> or locked in going to drainage..." are the scarcely attractive openings of three recent poems; little or nothing can be made of them until the whole poem has been read at least once, and preferably several times.</w:t>
+        <w:t>The poems are not immediately inviting: there is no ingratiation and glad hand, no drum roll or enticing McGuffin, no attention-grabbing dramatics. "Profuse reclaim from a scrape or belt, funnel do / axial parenthood block the mustard dots briefly / act forward…"; "Assuming banishment for lost time back across nullity…"; "Pacify rag hands attachment in for muted / counter-march</w:t>
+      </w:r>
+      <w:r>
+        <w:t xml:space="preserve"> or locked in going to drainage…" are the scarcely attractive openings of three recent poems; little or nothing can be made of them until the whole poem has been read at least once, and preferably several times.</w:t>
       </w:r>
     </w:p>
     <w:p/>

</xml_diff>